<commit_message>
Day15-MultiToolAgent: guard core AI/tool-calling call, add project.md
InvokePromptAsync (and the auto-invoked tool round trips behind it)
was unguarded - a network blip or API error would crash the whole
console app. Wraps it in try/catch. Syncs the docx's Complete Code
listing and replaces missing.md with project.md.
</commit_message>
<xml_diff>
--- a/Day15-MultiToolAgent.docx
+++ b/Day15-MultiToolAgent.docx
@@ -1249,37 +1249,205 @@
           <w:sz w:val="19"/>
         </w:rPr>
       </w:pPr>
-    </w:p>
-    <w:p>
-      <w:pPr>
-        <w:pStyle w:val="NoSpacing"/>
-        <w:rPr>
-          <w:rFonts w:ascii="Consolas" w:hAnsi="Consolas"/>
-          <w:sz w:val="19"/>
-        </w:rPr>
-      </w:pPr>
-      <w:r>
-        <w:rPr>
-          <w:rFonts w:ascii="Consolas" w:hAnsi="Consolas"/>
-          <w:sz w:val="19"/>
-        </w:rPr>
-        <w:t xml:space="preserve">            var result = await kernel.InvokePromptAsync(userRequest, new KernelArguments(settings));</w:t>
-      </w:r>
-    </w:p>
-    <w:p>
-      <w:pPr>
-        <w:pStyle w:val="NoSpacing"/>
-        <w:rPr>
-          <w:rFonts w:ascii="Consolas" w:hAnsi="Consolas"/>
-          <w:sz w:val="19"/>
-        </w:rPr>
-      </w:pPr>
-      <w:r>
-        <w:rPr>
-          <w:rFonts w:ascii="Consolas" w:hAnsi="Consolas"/>
-          <w:sz w:val="19"/>
-        </w:rPr>
-        <w:t xml:space="preserve">            Console.WriteLine($"\nFinal response: {result}");</w:t>
+      <w:r>
+        <w:rPr>
+          <w:rFonts w:ascii="Consolas" w:hAnsi="Consolas"/>
+          <w:sz w:val="19"/>
+        </w:rPr>
+        <w:t xml:space="preserve">            // 5. Guard the model call - Gemini's API call and the auto-invoked</w:t>
+      </w:r>
+    </w:p>
+    <w:p>
+      <w:pPr>
+        <w:pStyle w:val="NoSpacing"/>
+        <w:rPr>
+          <w:rFonts w:ascii="Consolas" w:hAnsi="Consolas"/>
+          <w:sz w:val="19"/>
+        </w:rPr>
+      </w:pPr>
+      <w:r>
+        <w:rPr>
+          <w:rFonts w:ascii="Consolas" w:hAnsi="Consolas"/>
+          <w:sz w:val="19"/>
+        </w:rPr>
+        <w:t xml:space="preserve">            // tool round trips behind it are the riskiest part of this program;</w:t>
+      </w:r>
+    </w:p>
+    <w:p>
+      <w:pPr>
+        <w:pStyle w:val="NoSpacing"/>
+        <w:rPr>
+          <w:rFonts w:ascii="Consolas" w:hAnsi="Consolas"/>
+          <w:sz w:val="19"/>
+        </w:rPr>
+      </w:pPr>
+      <w:r>
+        <w:rPr>
+          <w:rFonts w:ascii="Consolas" w:hAnsi="Consolas"/>
+          <w:sz w:val="19"/>
+        </w:rPr>
+        <w:t xml:space="preserve">            // without a catch here, a network hiccup or API error would crash</w:t>
+      </w:r>
+    </w:p>
+    <w:p>
+      <w:pPr>
+        <w:pStyle w:val="NoSpacing"/>
+        <w:rPr>
+          <w:rFonts w:ascii="Consolas" w:hAnsi="Consolas"/>
+          <w:sz w:val="19"/>
+        </w:rPr>
+      </w:pPr>
+      <w:r>
+        <w:rPr>
+          <w:rFonts w:ascii="Consolas" w:hAnsi="Consolas"/>
+          <w:sz w:val="19"/>
+        </w:rPr>
+        <w:t xml:space="preserve">            // the whole console app instead of just failing this one request.</w:t>
+      </w:r>
+    </w:p>
+    <w:p>
+      <w:pPr>
+        <w:pStyle w:val="NoSpacing"/>
+        <w:rPr>
+          <w:rFonts w:ascii="Consolas" w:hAnsi="Consolas"/>
+          <w:sz w:val="19"/>
+        </w:rPr>
+      </w:pPr>
+      <w:r>
+        <w:rPr>
+          <w:rFonts w:ascii="Consolas" w:hAnsi="Consolas"/>
+          <w:sz w:val="19"/>
+        </w:rPr>
+        <w:lastRenderedPageBreak/>
+        <w:t xml:space="preserve">            try</w:t>
+      </w:r>
+    </w:p>
+    <w:p>
+      <w:pPr>
+        <w:pStyle w:val="NoSpacing"/>
+        <w:rPr>
+          <w:rFonts w:ascii="Consolas" w:hAnsi="Consolas"/>
+          <w:sz w:val="19"/>
+        </w:rPr>
+      </w:pPr>
+      <w:r>
+        <w:rPr>
+          <w:rFonts w:ascii="Consolas" w:hAnsi="Consolas"/>
+          <w:sz w:val="19"/>
+        </w:rPr>
+        <w:t xml:space="preserve">            {</w:t>
+      </w:r>
+    </w:p>
+    <w:p>
+      <w:pPr>
+        <w:pStyle w:val="NoSpacing"/>
+        <w:rPr>
+          <w:rFonts w:ascii="Consolas" w:hAnsi="Consolas"/>
+          <w:sz w:val="19"/>
+        </w:rPr>
+      </w:pPr>
+      <w:r>
+        <w:rPr>
+          <w:rFonts w:ascii="Consolas" w:hAnsi="Consolas"/>
+          <w:sz w:val="19"/>
+        </w:rPr>
+        <w:t xml:space="preserve">                var result = await kernel.InvokePromptAsync(userRequest, new KernelArguments(settings));</w:t>
+      </w:r>
+    </w:p>
+    <w:p>
+      <w:pPr>
+        <w:pStyle w:val="NoSpacing"/>
+        <w:rPr>
+          <w:rFonts w:ascii="Consolas" w:hAnsi="Consolas"/>
+          <w:sz w:val="19"/>
+        </w:rPr>
+      </w:pPr>
+      <w:r>
+        <w:rPr>
+          <w:rFonts w:ascii="Consolas" w:hAnsi="Consolas"/>
+          <w:sz w:val="19"/>
+        </w:rPr>
+        <w:t xml:space="preserve">                Console.WriteLine($"\nFinal response: {result}");</w:t>
+      </w:r>
+    </w:p>
+    <w:p>
+      <w:pPr>
+        <w:pStyle w:val="NoSpacing"/>
+        <w:rPr>
+          <w:rFonts w:ascii="Consolas" w:hAnsi="Consolas"/>
+          <w:sz w:val="19"/>
+        </w:rPr>
+      </w:pPr>
+      <w:r>
+        <w:rPr>
+          <w:rFonts w:ascii="Consolas" w:hAnsi="Consolas"/>
+          <w:sz w:val="19"/>
+        </w:rPr>
+        <w:t xml:space="preserve">            }</w:t>
+      </w:r>
+    </w:p>
+    <w:p>
+      <w:pPr>
+        <w:pStyle w:val="NoSpacing"/>
+        <w:rPr>
+          <w:rFonts w:ascii="Consolas" w:hAnsi="Consolas"/>
+          <w:sz w:val="19"/>
+        </w:rPr>
+      </w:pPr>
+      <w:r>
+        <w:rPr>
+          <w:rFonts w:ascii="Consolas" w:hAnsi="Consolas"/>
+          <w:sz w:val="19"/>
+        </w:rPr>
+        <w:t xml:space="preserve">            catch (Exception ex)</w:t>
+      </w:r>
+    </w:p>
+    <w:p>
+      <w:pPr>
+        <w:pStyle w:val="NoSpacing"/>
+        <w:rPr>
+          <w:rFonts w:ascii="Consolas" w:hAnsi="Consolas"/>
+          <w:sz w:val="19"/>
+        </w:rPr>
+      </w:pPr>
+      <w:r>
+        <w:rPr>
+          <w:rFonts w:ascii="Consolas" w:hAnsi="Consolas"/>
+          <w:sz w:val="19"/>
+        </w:rPr>
+        <w:t xml:space="preserve">            {</w:t>
+      </w:r>
+    </w:p>
+    <w:p>
+      <w:pPr>
+        <w:pStyle w:val="NoSpacing"/>
+        <w:rPr>
+          <w:rFonts w:ascii="Consolas" w:hAnsi="Consolas"/>
+          <w:sz w:val="19"/>
+        </w:rPr>
+      </w:pPr>
+      <w:r>
+        <w:rPr>
+          <w:rFonts w:ascii="Consolas" w:hAnsi="Consolas"/>
+          <w:sz w:val="19"/>
+        </w:rPr>
+        <w:t xml:space="preserve">                Console.WriteLine($"\nAgent run failed: {ex.Message}");</w:t>
+      </w:r>
+    </w:p>
+    <w:p>
+      <w:pPr>
+        <w:pStyle w:val="NoSpacing"/>
+        <w:rPr>
+          <w:rFonts w:ascii="Consolas" w:hAnsi="Consolas"/>
+          <w:sz w:val="19"/>
+        </w:rPr>
+      </w:pPr>
+      <w:r>
+        <w:rPr>
+          <w:rFonts w:ascii="Consolas" w:hAnsi="Consolas"/>
+          <w:sz w:val="19"/>
+        </w:rPr>
+        <w:t xml:space="preserve">            }</w:t>
       </w:r>
     </w:p>
     <w:p>
@@ -1389,14 +1557,11 @@
         <w:rPr>
           <w:b/>
         </w:rPr>
+        <w:lastRenderedPageBreak/>
         <w:t>Step 4: The Deliberately Compound Question.</w:t>
       </w:r>
       <w:r>
-        <w:t xml:space="preserve"> The user request — "What time is it, and should I bring an umbrella in Salt Lake City today?" — is engineered on purpose to require *both* plugins. A single-tool question wouldn't prove that the model is actually choosing among options; this question forces the model to parse out two separate needs (a time </w:t>
-      </w:r>
-      <w:r>
-        <w:lastRenderedPageBreak/>
-        <w:t>lookup, a weather lookup with a specific city) from one sentence and route each to the correct function.</w:t>
+        <w:t xml:space="preserve"> The user request — "What time is it, and should I bring an umbrella in Salt Lake City today?" — is engineered on purpose to require *both* plugins. A single-tool question wouldn't prove that the model is actually choosing among options; this question forces the model to parse out two separate needs (a time lookup, a weather lookup with a specific city) from one sentence and route each to the correct function.</w:t>
       </w:r>
     </w:p>
     <w:p/>

</xml_diff>